<commit_message>
Batch 4: Ma 17 + Joey 17 - cross-references added
</commit_message>
<xml_diff>
--- a/stories/docx/Joey 17.docx
+++ b/stories/docx/Joey 17.docx
@@ -88,6 +88,14 @@
       </w:pPr>
       <w:r>
         <w:t xml:space="preserve">Ma knows something is wrong. She keeps asking me if I am sleeping, if I am eating. I tell her yes. I do not tell her about the Greek. She has enough to worry about with Frank over there. Let her have her peace, at least for now.</w:t>
+      </w:r>
+    </w:p>
+    <w:p>
+      <w:pPr>
+        <w:pStyle w:val="BodyText"/>
+      </w:pPr>
+      <w:r>
+        <w:t xml:space="preserve">I got a letter from Frank last month. War is getting worse. He mentioned tunnels, a network underneath the hills. He did not say much, but I could tell he found something big. Something that could end this. I hope he stays safe.</w:t>
       </w:r>
     </w:p>
     <w:p>

</xml_diff>